<commit_message>
Se realiza cambios en pageobjects y loginsteps para la rama de modificaciones
</commit_message>
<xml_diff>
--- a/evidencias/carpetaprueba4TeamAutomation/reporteDeCasoDePruebaprueba4TeamAutomation.docx
+++ b/evidencias/carpetaprueba4TeamAutomation/reporteDeCasoDePruebaprueba4TeamAutomation.docx
@@ -282,6 +282,46 @@
       </w:r>
     </w:p>
     <w:p/>
+    <w:p>
+      <w:r>
+        <w:t>Se hizo una espera de 2</w:t>
+        <w:br/>
+        <w:drawing>
+          <wp:inline distT="0" distR="0" distB="0" distL="0">
+            <wp:extent cx="3810000" cy="2540000"/>
+            <wp:docPr id="7" name="Drawing 7" descr="007Se_hizo_una_espera_de_2.png"/>
+            <a:graphic xmlns:a="http://schemas.openxmlformats.org/drawingml/2006/main">
+              <a:graphicData uri="http://schemas.openxmlformats.org/drawingml/2006/picture">
+                <pic:pic xmlns:pic="http://schemas.openxmlformats.org/drawingml/2006/picture">
+                  <pic:nvPicPr>
+                    <pic:cNvPr id="0" name="Picture 7" descr="007Se_hizo_una_espera_de_2.png"/>
+                    <pic:cNvPicPr>
+                      <a:picLocks noChangeAspect="true"/>
+                    </pic:cNvPicPr>
+                  </pic:nvPicPr>
+                  <pic:blipFill>
+                    <a:blip r:embed="rId9"/>
+                    <a:stretch>
+                      <a:fillRect/>
+                    </a:stretch>
+                  </pic:blipFill>
+                  <pic:spPr>
+                    <a:xfrm>
+                      <a:off x="0" y="0"/>
+                      <a:ext cx="3810000" cy="2540000"/>
+                    </a:xfrm>
+                    <a:prstGeom prst="rect">
+                      <a:avLst/>
+                    </a:prstGeom>
+                  </pic:spPr>
+                </pic:pic>
+              </a:graphicData>
+            </a:graphic>
+          </wp:inline>
+        </w:drawing>
+      </w:r>
+    </w:p>
+    <w:p/>
   </w:body>
 </w:document>
 </file>
</xml_diff>